<commit_message>
some changes in cv and about page
</commit_message>
<xml_diff>
--- a/MUHAMMAD_ZIYAN_CV (1).docx
+++ b/MUHAMMAD_ZIYAN_CV (1).docx
@@ -14,18 +14,22 @@
         <w:rPr>
           <w:rFonts w:ascii="Calibri" w:hAnsi="Calibri"/>
           <w:b/>
-          <w:sz w:val="28"/>
+          <w:sz w:val="36"/>
+          <w:szCs w:val="36"/>
         </w:rPr>
         <w:t xml:space="preserve">Muhammad </w:t>
       </w:r>
+      <w:proofErr w:type="spellStart"/>
       <w:r>
         <w:rPr>
           <w:rFonts w:ascii="Calibri" w:hAnsi="Calibri"/>
           <w:b/>
-          <w:sz w:val="28"/>
+          <w:sz w:val="36"/>
+          <w:szCs w:val="36"/>
         </w:rPr>
         <w:t>Ziyan</w:t>
       </w:r>
+      <w:proofErr w:type="spellEnd"/>
       <w:r>
         <w:rPr>
           <w:rFonts w:ascii="Calibri" w:hAnsi="Calibri"/>
@@ -37,6 +41,8 @@
         <w:rPr>
           <w:rFonts w:ascii="Calibri" w:hAnsi="Calibri"/>
           <w:color w:val="0066CC"/>
+          <w:sz w:val="28"/>
+          <w:szCs w:val="28"/>
         </w:rPr>
         <w:t xml:space="preserve">Backend </w:t>
       </w:r>
@@ -44,15 +50,10 @@
         <w:rPr>
           <w:rFonts w:ascii="Calibri" w:hAnsi="Calibri"/>
           <w:color w:val="0066CC"/>
+          <w:sz w:val="28"/>
+          <w:szCs w:val="28"/>
         </w:rPr>
         <w:t>Developer</w:t>
-      </w:r>
-      <w:r>
-        <w:rPr>
-          <w:rFonts w:ascii="Calibri" w:hAnsi="Calibri"/>
-          <w:color w:val="0066CC"/>
-        </w:rPr>
-        <w:br/>
       </w:r>
     </w:p>
     <w:p>
@@ -214,12 +215,15 @@
         <w:pStyle w:val="Heading3"/>
         <w:spacing w:before="20" w:after="60" w:line="264" w:lineRule="auto"/>
         <w:rPr>
-          <w:sz w:val="24"/>
+          <w:sz w:val="28"/>
+          <w:szCs w:val="28"/>
         </w:rPr>
       </w:pPr>
       <w:r>
         <w:rPr>
           <w:rFonts w:ascii="Calibri" w:hAnsi="Calibri"/>
+          <w:sz w:val="28"/>
+          <w:szCs w:val="28"/>
         </w:rPr>
         <w:t>SKILLS</w:t>
       </w:r>
@@ -246,8 +250,6 @@
       <w:r>
         <w:t>TypeScript</w:t>
       </w:r>
-      <w:bookmarkStart w:id="0" w:name="_GoBack"/>
-      <w:bookmarkEnd w:id="0"/>
     </w:p>
     <w:p>
       <w:pPr>
@@ -333,10 +335,20 @@
     <w:p>
       <w:pPr>
         <w:pStyle w:val="Heading3"/>
+        <w:rPr>
+          <w:sz w:val="28"/>
+          <w:szCs w:val="28"/>
+        </w:rPr>
       </w:pPr>
       <w:r>
         <w:lastRenderedPageBreak/>
         <w:br/>
+      </w:r>
+      <w:r>
+        <w:rPr>
+          <w:sz w:val="28"/>
+          <w:szCs w:val="28"/>
+        </w:rPr>
         <w:t>EXPERIENCE</w:t>
       </w:r>
     </w:p>
@@ -347,6 +359,7 @@
           <w:rFonts w:ascii="Calibri" w:hAnsi="Calibri"/>
         </w:rPr>
       </w:pPr>
+      <w:proofErr w:type="gramStart"/>
       <w:r>
         <w:rPr>
           <w:rFonts w:ascii="Calibri" w:hAnsi="Calibri"/>
@@ -391,7 +404,7 @@
         <w:rPr>
           <w:rFonts w:ascii="Calibri" w:hAnsi="Calibri"/>
         </w:rPr>
-        <w:t xml:space="preserve"> – Present</w:t>
+        <w:t xml:space="preserve"> – April 2026</w:t>
       </w:r>
       <w:r>
         <w:rPr>
@@ -410,7 +423,14 @@
         <w:rPr>
           <w:rFonts w:ascii="Calibri" w:hAnsi="Calibri"/>
         </w:rPr>
-        <w:t xml:space="preserve">Backend Developer with hands-on experience in architecting scalable server-side solutions. Recently completed a Backend Internship where I specialized in designing system workflows, implementing RESTful APIs, and optimizing database performance. Developed 2-3 full-scale backend projects using </w:t>
+        <w:t>Backend Developer with hands-on experience in architecting scalable server-side solutions.</w:t>
+      </w:r>
+      <w:proofErr w:type="gramEnd"/>
+      <w:r>
+        <w:rPr>
+          <w:rFonts w:ascii="Calibri" w:hAnsi="Calibri"/>
+        </w:rPr>
+        <w:t xml:space="preserve"> Recently completed a Backend Internship where I specialized in designing system workflows, implementing RESTful APIs, and optimizing database performance. Developed 2-3 full-scale backend projects using </w:t>
       </w:r>
       <w:proofErr w:type="spellStart"/>
       <w:r>
@@ -468,7 +488,8 @@
         <w:pStyle w:val="Heading3"/>
         <w:spacing w:before="20" w:after="60" w:line="264" w:lineRule="auto"/>
         <w:rPr>
-          <w:sz w:val="24"/>
+          <w:sz w:val="28"/>
+          <w:szCs w:val="28"/>
         </w:rPr>
       </w:pPr>
       <w:r>
@@ -476,6 +497,13 @@
           <w:rFonts w:ascii="Calibri" w:hAnsi="Calibri"/>
         </w:rPr>
         <w:br/>
+      </w:r>
+      <w:r>
+        <w:rPr>
+          <w:rFonts w:ascii="Calibri" w:hAnsi="Calibri"/>
+          <w:sz w:val="28"/>
+          <w:szCs w:val="28"/>
+        </w:rPr>
         <w:t>PROJECTS</w:t>
       </w:r>
     </w:p>
@@ -545,13 +573,6 @@
         <w:rPr>
           <w:rFonts w:ascii="Calibri" w:hAnsi="Calibri"/>
         </w:rPr>
-        <w:sectPr>
-          <w:type w:val="continuous"/>
-          <w:pgSz w:w="12240" w:h="15840"/>
-          <w:pgMar w:top="720" w:right="864" w:bottom="720" w:left="864" w:header="720" w:footer="720" w:gutter="0"/>
-          <w:cols w:space="720"/>
-          <w:docGrid w:linePitch="360"/>
-        </w:sectPr>
       </w:pPr>
       <w:r>
         <w:rPr>
@@ -565,6 +586,23 @@
         </w:rPr>
         <w:t>https://currency-convertor-psi-rust.vercel.app/</w:t>
       </w:r>
+      <w:bookmarkStart w:id="0" w:name="_GoBack"/>
+      <w:bookmarkEnd w:id="0"/>
+    </w:p>
+    <w:p>
+      <w:pPr>
+        <w:spacing w:before="20" w:after="60" w:line="264" w:lineRule="auto"/>
+        <w:rPr>
+          <w:rFonts w:ascii="Calibri" w:hAnsi="Calibri"/>
+        </w:rPr>
+        <w:sectPr>
+          <w:type w:val="continuous"/>
+          <w:pgSz w:w="12240" w:h="15840"/>
+          <w:pgMar w:top="720" w:right="864" w:bottom="720" w:left="864" w:header="720" w:footer="720" w:gutter="0"/>
+          <w:cols w:space="720"/>
+          <w:docGrid w:linePitch="360"/>
+        </w:sectPr>
+      </w:pPr>
       <w:r>
         <w:rPr>
           <w:rFonts w:ascii="Calibri" w:hAnsi="Calibri"/>
@@ -577,12 +615,15 @@
         <w:pStyle w:val="Heading3"/>
         <w:spacing w:before="20" w:after="60" w:line="264" w:lineRule="auto"/>
         <w:rPr>
-          <w:sz w:val="24"/>
+          <w:sz w:val="28"/>
+          <w:szCs w:val="28"/>
         </w:rPr>
       </w:pPr>
       <w:r>
         <w:rPr>
           <w:rFonts w:ascii="Calibri" w:hAnsi="Calibri"/>
+          <w:sz w:val="28"/>
+          <w:szCs w:val="28"/>
         </w:rPr>
         <w:lastRenderedPageBreak/>
         <w:t>EDUCATION</w:t>
@@ -750,7 +791,8 @@
         <w:pStyle w:val="Heading3"/>
         <w:spacing w:before="20" w:after="60" w:line="264" w:lineRule="auto"/>
         <w:rPr>
-          <w:sz w:val="24"/>
+          <w:sz w:val="28"/>
+          <w:szCs w:val="28"/>
         </w:rPr>
       </w:pPr>
       <w:r>
@@ -762,6 +804,8 @@
       <w:r>
         <w:rPr>
           <w:rFonts w:ascii="Calibri" w:hAnsi="Calibri"/>
+          <w:sz w:val="28"/>
+          <w:szCs w:val="28"/>
         </w:rPr>
         <w:t>CERTIFICATION</w:t>
       </w:r>
@@ -25077,7 +25121,7 @@
 </file>
 
 <file path=customXml/itemProps1.xml><?xml version="1.0" encoding="utf-8"?>
-<ds:datastoreItem xmlns:ds="http://schemas.openxmlformats.org/officeDocument/2006/customXml" ds:itemID="{D116C3DF-83CE-4B6E-8C04-2691651BBEC3}">
+<ds:datastoreItem xmlns:ds="http://schemas.openxmlformats.org/officeDocument/2006/customXml" ds:itemID="{E589D795-1E48-4B2C-ABF1-699F573FE742}">
   <ds:schemaRefs>
     <ds:schemaRef ds:uri="http://schemas.openxmlformats.org/officeDocument/2006/bibliography"/>
   </ds:schemaRefs>

</xml_diff>